<commit_message>
Video guide: product, architecture, repo link
Co-Authored-By: Claude Opus 5.5 <noreply@anthropic.com>
Claude-Session: https://claude.ai/code/session_01FB5R4wHNhxiDJGzFr7AAfB
</commit_message>
<xml_diff>
--- a/submission/Video_Guide_KYC_Preflight.docx
+++ b/submission/Video_Guide_KYC_Preflight.docx
@@ -2,7 +2,7 @@
 <file path=word/document.xml><?xml version="1.0" encoding="utf-8"?>
 <w:document xmlns:w="http://schemas.openxmlformats.org/wordprocessingml/2006/main" xmlns:m="http://schemas.openxmlformats.org/officeDocument/2006/math" xmlns:r="http://schemas.openxmlformats.org/officeDocument/2006/relationships" xmlns:o="urn:schemas-microsoft-com:office:office" xmlns:v="urn:schemas-microsoft-com:vml" xmlns:w10="urn:schemas-microsoft-com:office:word" xmlns:a="http://schemas.openxmlformats.org/drawingml/2006/main" xmlns:pic="http://schemas.openxmlformats.org/drawingml/2006/picture" xmlns:wp="http://schemas.openxmlformats.org/drawingml/2006/wordprocessingDrawing">
   <w:body>
-    <w:bookmarkStart w:id="25" w:name="kyc-pre-flight-demo-video-guide"/>
+    <w:bookmarkStart w:id="27" w:name="kyc-pre-flight-demo-video-guide"/>
     <w:p>
       <w:pPr>
         <w:pStyle w:val="Heading1"/>
@@ -23,6 +23,12 @@
       </w:r>
       <w:r>
         <w:t xml:space="preserve">Naimeesh Tiwari, ISB PGP Co’27 · Prototype: https://kyc-preflight.vercel.app</w:t>
+      </w:r>
+      <w:r>
+        <w:t xml:space="preserve"> </w:t>
+      </w:r>
+      <w:r>
+        <w:t xml:space="preserve">Code, product note and AI build log: https://github.com/naimeeshgit/kyc-preflight</w:t>
       </w:r>
     </w:p>
     <w:bookmarkStart w:id="20" w:name="the-user-problem"/>
@@ -76,7 +82,167 @@
       </w:r>
     </w:p>
     <w:bookmarkEnd w:id="21"/>
-    <w:bookmarkStart w:id="22" w:name="what-the-video-shows"/>
+    <w:bookmarkStart w:id="22" w:name="what-the-product-is"/>
+    <w:p>
+      <w:pPr>
+        <w:pStyle w:val="Heading2"/>
+      </w:pPr>
+      <w:r>
+        <w:t xml:space="preserve">What the product is</w:t>
+      </w:r>
+    </w:p>
+    <w:p>
+      <w:pPr>
+        <w:pStyle w:val="FirstParagraph"/>
+      </w:pPr>
+      <w:r>
+        <w:t xml:space="preserve">KYC Pre-flight is a step inside the Razorpay merchant app that runs before the KYC fee. In about two minutes it checks, one question at a time: whether her business category is allowed, which documents she needs for how her business is set up, whether her KYC will be instant or need a video call, whether the names on her PAN, Aadhaar and bank account will match, whether her Instagram, catalog and invoice tell a consistent story, and whether her website has the five policy pages. She ends with a go-live pass with one stamp per check. Payment stays blocked while anything is red. An in-app assistant drafts what is missing (a refund policy, a bank letter, answers for the reviewer), and Razorpay’s reviewer receives a pre-checked case file.</w:t>
+      </w:r>
+    </w:p>
+    <w:bookmarkEnd w:id="22"/>
+    <w:bookmarkStart w:id="23" w:name="architecture"/>
+    <w:p>
+      <w:pPr>
+        <w:pStyle w:val="Heading2"/>
+      </w:pPr>
+      <w:r>
+        <w:t xml:space="preserve">Architecture</w:t>
+      </w:r>
+    </w:p>
+    <w:p>
+      <w:pPr>
+        <w:numPr>
+          <w:ilvl w:val="0"/>
+          <w:numId w:val="1001"/>
+        </w:numPr>
+        <w:pStyle w:val="Compact"/>
+      </w:pPr>
+      <w:r>
+        <w:t xml:space="preserve">App: Expo / React Native, running on the web (react-native-web) and deployed on Vercel.</w:t>
+      </w:r>
+    </w:p>
+    <w:p>
+      <w:pPr>
+        <w:numPr>
+          <w:ilvl w:val="0"/>
+          <w:numId w:val="1001"/>
+        </w:numPr>
+        <w:pStyle w:val="Compact"/>
+      </w:pPr>
+      <w:r>
+        <w:t xml:space="preserve">Server: Vercel serverless functions. The Anthropic API key lives only in server environment variables.</w:t>
+      </w:r>
+    </w:p>
+    <w:p>
+      <w:pPr>
+        <w:numPr>
+          <w:ilvl w:val="0"/>
+          <w:numId w:val="1001"/>
+        </w:numPr>
+        <w:pStyle w:val="Compact"/>
+      </w:pPr>
+      <w:r>
+        <w:t xml:space="preserve">Model: Claude Haiku through the Anthropic Messages API, always with forced tool calls and fixed output schemas.</w:t>
+      </w:r>
+    </w:p>
+    <w:p>
+      <w:pPr>
+        <w:numPr>
+          <w:ilvl w:val="0"/>
+          <w:numId w:val="1001"/>
+        </w:numPr>
+        <w:pStyle w:val="Compact"/>
+      </w:pPr>
+      <w:r>
+        <w:t xml:space="preserve">Category check: a BM25 retriever picks 8 of Razorpay’s 340 published sub-categories (25 blocked, 74 reviewed by hand). The model may choose only among those 8. A deterministic policy then decides: supported, ask one question, or send to a human reviewer (confidence threshold, mixed-candidate check, blocked-term tripwire).</w:t>
+      </w:r>
+    </w:p>
+    <w:p>
+      <w:pPr>
+        <w:numPr>
+          <w:ilvl w:val="0"/>
+          <w:numId w:val="1001"/>
+        </w:numPr>
+        <w:pStyle w:val="Compact"/>
+      </w:pPr>
+      <w:r>
+        <w:t xml:space="preserve">Document plan: a rule table by entity type (individual, proprietor, partnership, company) plus category extras such as FSSAI.</w:t>
+      </w:r>
+    </w:p>
+    <w:p>
+      <w:pPr>
+        <w:numPr>
+          <w:ilvl w:val="0"/>
+          <w:numId w:val="1001"/>
+        </w:numPr>
+        <w:pStyle w:val="Compact"/>
+      </w:pPr>
+      <w:r>
+        <w:t xml:space="preserve">KYC route: a registry adapter (CKYC, mocked) returns instant or video call.</w:t>
+      </w:r>
+    </w:p>
+    <w:p>
+      <w:pPr>
+        <w:numPr>
+          <w:ilvl w:val="0"/>
+          <w:numId w:val="1001"/>
+        </w:numPr>
+        <w:pStyle w:val="Compact"/>
+      </w:pPr>
+      <w:r>
+        <w:t xml:space="preserve">Names: the model reads PAN, Aadhaar and bank proof; a deterministic name engine (word order, initials, honorifics, Devanagari and Telugu transliteration, phonetic keys) decides the match. Any bank result short of a match blocks payment.</w:t>
+      </w:r>
+    </w:p>
+    <w:p>
+      <w:pPr>
+        <w:numPr>
+          <w:ilvl w:val="0"/>
+          <w:numId w:val="1001"/>
+        </w:numPr>
+        <w:pStyle w:val="Compact"/>
+      </w:pPr>
+      <w:r>
+        <w:t xml:space="preserve">Proof of business: the model extracts only visible facts from images; rules cross-check name, owner, products, prices and contact across sources.</w:t>
+      </w:r>
+    </w:p>
+    <w:p>
+      <w:pPr>
+        <w:numPr>
+          <w:ilvl w:val="0"/>
+          <w:numId w:val="1001"/>
+        </w:numPr>
+        <w:pStyle w:val="Compact"/>
+      </w:pPr>
+      <w:r>
+        <w:t xml:space="preserve">Website: fetched server-side and checked for terms, privacy, refund, shipping and contact pages.</w:t>
+      </w:r>
+    </w:p>
+    <w:p>
+      <w:pPr>
+        <w:numPr>
+          <w:ilvl w:val="0"/>
+          <w:numId w:val="1001"/>
+        </w:numPr>
+        <w:pStyle w:val="Compact"/>
+      </w:pPr>
+      <w:r>
+        <w:t xml:space="preserve">Assistant: grounded in her case object; never predicts approval, never helps reword a blocked business, never explains risk signals.</w:t>
+      </w:r>
+    </w:p>
+    <w:p>
+      <w:pPr>
+        <w:numPr>
+          <w:ilvl w:val="0"/>
+          <w:numId w:val="1001"/>
+        </w:numPr>
+        <w:pStyle w:val="Compact"/>
+      </w:pPr>
+      <w:r>
+        <w:t xml:space="preserve">Evals: 146 labelled business descriptions and 304 name pairs, runnable in the app.</w:t>
+      </w:r>
+    </w:p>
+    <w:bookmarkEnd w:id="23"/>
+    <w:bookmarkStart w:id="24" w:name="what-the-video-shows"/>
     <w:p>
       <w:pPr>
         <w:pStyle w:val="Heading2"/>
@@ -511,8 +677,8 @@
         </w:tc>
       </w:tr>
     </w:tbl>
-    <w:bookmarkEnd w:id="22"/>
-    <w:bookmarkStart w:id="23" w:name="what-makes-it-work"/>
+    <w:bookmarkEnd w:id="24"/>
+    <w:bookmarkStart w:id="25" w:name="what-makes-it-work"/>
     <w:p>
       <w:pPr>
         <w:pStyle w:val="Heading2"/>
@@ -525,7 +691,7 @@
       <w:pPr>
         <w:numPr>
           <w:ilvl w:val="0"/>
-          <w:numId w:val="1001"/>
+          <w:numId w:val="1002"/>
         </w:numPr>
         <w:pStyle w:val="Compact"/>
       </w:pPr>
@@ -537,7 +703,7 @@
       <w:pPr>
         <w:numPr>
           <w:ilvl w:val="0"/>
-          <w:numId w:val="1001"/>
+          <w:numId w:val="1002"/>
         </w:numPr>
         <w:pStyle w:val="Compact"/>
       </w:pPr>
@@ -549,7 +715,7 @@
       <w:pPr>
         <w:numPr>
           <w:ilvl w:val="0"/>
-          <w:numId w:val="1001"/>
+          <w:numId w:val="1002"/>
         </w:numPr>
         <w:pStyle w:val="Compact"/>
       </w:pPr>
@@ -561,7 +727,7 @@
       <w:pPr>
         <w:numPr>
           <w:ilvl w:val="0"/>
-          <w:numId w:val="1001"/>
+          <w:numId w:val="1002"/>
         </w:numPr>
         <w:pStyle w:val="Compact"/>
       </w:pPr>
@@ -569,8 +735,8 @@
         <w:t xml:space="preserve">Tested on 146 business descriptions and 304 name pairs that I wrote, so these are regression numbers, not field data.</w:t>
       </w:r>
     </w:p>
-    <w:bookmarkEnd w:id="23"/>
-    <w:bookmarkStart w:id="24" w:name="not-shown-or-not-built"/>
+    <w:bookmarkEnd w:id="25"/>
+    <w:bookmarkStart w:id="26" w:name="not-shown-or-not-built"/>
     <w:p>
       <w:pPr>
         <w:pStyle w:val="Heading2"/>
@@ -587,8 +753,8 @@
         <w:t xml:space="preserve">Registry, bank penny drop and payment calls are mocked. Demo stores and documents are fictional. AI approvals and workarounds for restricted categories are deliberately left out.</w:t>
       </w:r>
     </w:p>
-    <w:bookmarkEnd w:id="24"/>
-    <w:bookmarkEnd w:id="25"/>
+    <w:bookmarkEnd w:id="26"/>
+    <w:bookmarkEnd w:id="27"/>
     <w:sectPr/>
   </w:body>
 </w:document>
@@ -775,6 +941,9 @@
     <w:abstractNumId w:val="990"/>
   </w:num>
   <w:num w:numId="1001">
+    <w:abstractNumId w:val="991"/>
+  </w:num>
+  <w:num w:numId="1002">
     <w:abstractNumId w:val="991"/>
   </w:num>
 </w:numbering>

</xml_diff>